<commit_message>
Migrate database to MongoDB Atlas and integrate Supabase Cloud Storage
</commit_message>
<xml_diff>
--- a/LAB TIME SLOT MANAGEMENT.docx
+++ b/LAB TIME SLOT MANAGEMENT.docx
@@ -3466,6 +3466,8 @@
             </w:r>
           </w:p>
         </w:tc>
+        <w:bookmarkStart w:id="0" w:name="_GoBack"/>
+        <w:bookmarkEnd w:id="0"/>
       </w:tr>
       <w:tr>
         <w:trPr>
@@ -9362,6 +9364,7 @@
         <w:pStyle w:val="Heading3"/>
       </w:pPr>
       <w:r>
+        <w:lastRenderedPageBreak/>
         <w:t>4.1.2 CONCEPTUAL DESIGN</w:t>
       </w:r>
     </w:p>
@@ -9433,6 +9436,7 @@
     </w:p>
     <w:p>
       <w:r>
+        <w:lastRenderedPageBreak/>
         <w:t>• Presentation Layer: Developed as a React 19 Single Page Application bundled with Vite. It uses HSL-based Tailwind CSS to render a modern Glassmorphism theme (backdrop-filter: blur(16px), 1px border opacity reflections, neon accents) and displays dynamic vector icons powered by lucide-react.</w:t>
       </w:r>
     </w:p>
@@ -9527,6 +9531,7 @@
     </w:p>
     <w:p>
       <w:r>
+        <w:lastRenderedPageBreak/>
         <w:t>• Lexical Classification Badges: Displays high-contrast, color-coded tags on each cataloged document: Emerald Green for Assignments, Amber Yellow for Circulars, Intense Cyan for Lab Records, Royal Purple for Syllabus, Soft Sapphire Blue for Lecture Notes, and Slate Grey for Uncategorized files.</w:t>
       </w:r>
     </w:p>
@@ -9564,19 +9569,19 @@
     <w:tbl>
       <w:tblPr>
         <w:tblStyle w:val="TableGrid"/>
-        <w:tblW w:type="auto" w:w="0"/>
-        <w:tblLook w:firstColumn="1" w:firstRow="1" w:lastColumn="0" w:lastRow="0" w:noHBand="0" w:noVBand="1" w:val="04A0"/>
+        <w:tblW w:w="0" w:type="auto"/>
+        <w:tblLook w:val="04A0" w:firstRow="1" w:lastRow="0" w:firstColumn="1" w:lastColumn="0" w:noHBand="0" w:noVBand="1"/>
       </w:tblPr>
       <w:tblGrid>
-        <w:gridCol w:w="2257"/>
-        <w:gridCol w:w="2257"/>
-        <w:gridCol w:w="2257"/>
-        <w:gridCol w:w="2257"/>
+        <w:gridCol w:w="2256"/>
+        <w:gridCol w:w="2254"/>
+        <w:gridCol w:w="2255"/>
+        <w:gridCol w:w="2255"/>
       </w:tblGrid>
       <w:tr>
         <w:tc>
           <w:tcPr>
-            <w:tcW w:type="dxa" w:w="2257"/>
+            <w:tcW w:w="2257" w:type="dxa"/>
           </w:tcPr>
           <w:p>
             <w:r>
@@ -9590,7 +9595,7 @@
         </w:tc>
         <w:tc>
           <w:tcPr>
-            <w:tcW w:type="dxa" w:w="2257"/>
+            <w:tcW w:w="2257" w:type="dxa"/>
           </w:tcPr>
           <w:p>
             <w:r>
@@ -9604,7 +9609,7 @@
         </w:tc>
         <w:tc>
           <w:tcPr>
-            <w:tcW w:type="dxa" w:w="2257"/>
+            <w:tcW w:w="2257" w:type="dxa"/>
           </w:tcPr>
           <w:p>
             <w:r>
@@ -9618,7 +9623,7 @@
         </w:tc>
         <w:tc>
           <w:tcPr>
-            <w:tcW w:type="dxa" w:w="2257"/>
+            <w:tcW w:w="2257" w:type="dxa"/>
           </w:tcPr>
           <w:p>
             <w:r>
@@ -9634,7 +9639,7 @@
       <w:tr>
         <w:tc>
           <w:tcPr>
-            <w:tcW w:type="dxa" w:w="2257"/>
+            <w:tcW w:w="2257" w:type="dxa"/>
           </w:tcPr>
           <w:p>
             <w:r>
@@ -9647,7 +9652,7 @@
         </w:tc>
         <w:tc>
           <w:tcPr>
-            <w:tcW w:type="dxa" w:w="2257"/>
+            <w:tcW w:w="2257" w:type="dxa"/>
           </w:tcPr>
           <w:p>
             <w:r>
@@ -9660,7 +9665,7 @@
         </w:tc>
         <w:tc>
           <w:tcPr>
-            <w:tcW w:type="dxa" w:w="2257"/>
+            <w:tcW w:w="2257" w:type="dxa"/>
           </w:tcPr>
           <w:p>
             <w:r>
@@ -9673,7 +9678,7 @@
         </w:tc>
         <w:tc>
           <w:tcPr>
-            <w:tcW w:type="dxa" w:w="2257"/>
+            <w:tcW w:w="2257" w:type="dxa"/>
           </w:tcPr>
           <w:p>
             <w:r>
@@ -9688,7 +9693,7 @@
       <w:tr>
         <w:tc>
           <w:tcPr>
-            <w:tcW w:type="dxa" w:w="2257"/>
+            <w:tcW w:w="2257" w:type="dxa"/>
           </w:tcPr>
           <w:p>
             <w:r>
@@ -9701,7 +9706,7 @@
         </w:tc>
         <w:tc>
           <w:tcPr>
-            <w:tcW w:type="dxa" w:w="2257"/>
+            <w:tcW w:w="2257" w:type="dxa"/>
           </w:tcPr>
           <w:p>
             <w:r>
@@ -9714,7 +9719,7 @@
         </w:tc>
         <w:tc>
           <w:tcPr>
-            <w:tcW w:type="dxa" w:w="2257"/>
+            <w:tcW w:w="2257" w:type="dxa"/>
           </w:tcPr>
           <w:p>
             <w:r>
@@ -9727,7 +9732,7 @@
         </w:tc>
         <w:tc>
           <w:tcPr>
-            <w:tcW w:type="dxa" w:w="2257"/>
+            <w:tcW w:w="2257" w:type="dxa"/>
           </w:tcPr>
           <w:p>
             <w:r>
@@ -9742,7 +9747,7 @@
       <w:tr>
         <w:tc>
           <w:tcPr>
-            <w:tcW w:type="dxa" w:w="2257"/>
+            <w:tcW w:w="2257" w:type="dxa"/>
           </w:tcPr>
           <w:p>
             <w:r>
@@ -9755,7 +9760,7 @@
         </w:tc>
         <w:tc>
           <w:tcPr>
-            <w:tcW w:type="dxa" w:w="2257"/>
+            <w:tcW w:w="2257" w:type="dxa"/>
           </w:tcPr>
           <w:p>
             <w:r>
@@ -9768,7 +9773,7 @@
         </w:tc>
         <w:tc>
           <w:tcPr>
-            <w:tcW w:type="dxa" w:w="2257"/>
+            <w:tcW w:w="2257" w:type="dxa"/>
           </w:tcPr>
           <w:p>
             <w:r>
@@ -9781,7 +9786,7 @@
         </w:tc>
         <w:tc>
           <w:tcPr>
-            <w:tcW w:type="dxa" w:w="2257"/>
+            <w:tcW w:w="2257" w:type="dxa"/>
           </w:tcPr>
           <w:p>
             <w:r>
@@ -9796,7 +9801,7 @@
       <w:tr>
         <w:tc>
           <w:tcPr>
-            <w:tcW w:type="dxa" w:w="2257"/>
+            <w:tcW w:w="2257" w:type="dxa"/>
           </w:tcPr>
           <w:p>
             <w:r>
@@ -9809,7 +9814,7 @@
         </w:tc>
         <w:tc>
           <w:tcPr>
-            <w:tcW w:type="dxa" w:w="2257"/>
+            <w:tcW w:w="2257" w:type="dxa"/>
           </w:tcPr>
           <w:p>
             <w:r>
@@ -9822,7 +9827,7 @@
         </w:tc>
         <w:tc>
           <w:tcPr>
-            <w:tcW w:type="dxa" w:w="2257"/>
+            <w:tcW w:w="2257" w:type="dxa"/>
           </w:tcPr>
           <w:p>
             <w:r>
@@ -9835,7 +9840,7 @@
         </w:tc>
         <w:tc>
           <w:tcPr>
-            <w:tcW w:type="dxa" w:w="2257"/>
+            <w:tcW w:w="2257" w:type="dxa"/>
           </w:tcPr>
           <w:p>
             <w:r>
@@ -9850,7 +9855,7 @@
       <w:tr>
         <w:tc>
           <w:tcPr>
-            <w:tcW w:type="dxa" w:w="2257"/>
+            <w:tcW w:w="2257" w:type="dxa"/>
           </w:tcPr>
           <w:p>
             <w:r>
@@ -9863,7 +9868,7 @@
         </w:tc>
         <w:tc>
           <w:tcPr>
-            <w:tcW w:type="dxa" w:w="2257"/>
+            <w:tcW w:w="2257" w:type="dxa"/>
           </w:tcPr>
           <w:p>
             <w:r>
@@ -9876,7 +9881,7 @@
         </w:tc>
         <w:tc>
           <w:tcPr>
-            <w:tcW w:type="dxa" w:w="2257"/>
+            <w:tcW w:w="2257" w:type="dxa"/>
           </w:tcPr>
           <w:p>
             <w:r>
@@ -9889,7 +9894,7 @@
         </w:tc>
         <w:tc>
           <w:tcPr>
-            <w:tcW w:type="dxa" w:w="2257"/>
+            <w:tcW w:w="2257" w:type="dxa"/>
           </w:tcPr>
           <w:p>
             <w:r>
@@ -9904,7 +9909,7 @@
       <w:tr>
         <w:tc>
           <w:tcPr>
-            <w:tcW w:type="dxa" w:w="2257"/>
+            <w:tcW w:w="2257" w:type="dxa"/>
           </w:tcPr>
           <w:p>
             <w:r>
@@ -9917,7 +9922,7 @@
         </w:tc>
         <w:tc>
           <w:tcPr>
-            <w:tcW w:type="dxa" w:w="2257"/>
+            <w:tcW w:w="2257" w:type="dxa"/>
           </w:tcPr>
           <w:p>
             <w:r>
@@ -9930,7 +9935,7 @@
         </w:tc>
         <w:tc>
           <w:tcPr>
-            <w:tcW w:type="dxa" w:w="2257"/>
+            <w:tcW w:w="2257" w:type="dxa"/>
           </w:tcPr>
           <w:p>
             <w:r>
@@ -9943,7 +9948,7 @@
         </w:tc>
         <w:tc>
           <w:tcPr>
-            <w:tcW w:type="dxa" w:w="2257"/>
+            <w:tcW w:w="2257" w:type="dxa"/>
           </w:tcPr>
           <w:p>
             <w:r>
@@ -9958,7 +9963,7 @@
       <w:tr>
         <w:tc>
           <w:tcPr>
-            <w:tcW w:type="dxa" w:w="2257"/>
+            <w:tcW w:w="2257" w:type="dxa"/>
           </w:tcPr>
           <w:p>
             <w:r>
@@ -9971,7 +9976,7 @@
         </w:tc>
         <w:tc>
           <w:tcPr>
-            <w:tcW w:type="dxa" w:w="2257"/>
+            <w:tcW w:w="2257" w:type="dxa"/>
           </w:tcPr>
           <w:p>
             <w:r>
@@ -9984,7 +9989,7 @@
         </w:tc>
         <w:tc>
           <w:tcPr>
-            <w:tcW w:type="dxa" w:w="2257"/>
+            <w:tcW w:w="2257" w:type="dxa"/>
           </w:tcPr>
           <w:p>
             <w:r>
@@ -9997,7 +10002,7 @@
         </w:tc>
         <w:tc>
           <w:tcPr>
-            <w:tcW w:type="dxa" w:w="2257"/>
+            <w:tcW w:w="2257" w:type="dxa"/>
           </w:tcPr>
           <w:p>
             <w:r>
@@ -10012,7 +10017,7 @@
       <w:tr>
         <w:tc>
           <w:tcPr>
-            <w:tcW w:type="dxa" w:w="2257"/>
+            <w:tcW w:w="2257" w:type="dxa"/>
           </w:tcPr>
           <w:p>
             <w:r>
@@ -10025,7 +10030,7 @@
         </w:tc>
         <w:tc>
           <w:tcPr>
-            <w:tcW w:type="dxa" w:w="2257"/>
+            <w:tcW w:w="2257" w:type="dxa"/>
           </w:tcPr>
           <w:p>
             <w:r>
@@ -10038,7 +10043,7 @@
         </w:tc>
         <w:tc>
           <w:tcPr>
-            <w:tcW w:type="dxa" w:w="2257"/>
+            <w:tcW w:w="2257" w:type="dxa"/>
           </w:tcPr>
           <w:p>
             <w:r>
@@ -10051,7 +10056,7 @@
         </w:tc>
         <w:tc>
           <w:tcPr>
-            <w:tcW w:type="dxa" w:w="2257"/>
+            <w:tcW w:w="2257" w:type="dxa"/>
           </w:tcPr>
           <w:p>
             <w:r>
@@ -10080,19 +10085,19 @@
     <w:tbl>
       <w:tblPr>
         <w:tblStyle w:val="TableGrid"/>
-        <w:tblW w:type="auto" w:w="0"/>
-        <w:tblLook w:firstColumn="1" w:firstRow="1" w:lastColumn="0" w:lastRow="0" w:noHBand="0" w:noVBand="1" w:val="04A0"/>
+        <w:tblW w:w="0" w:type="auto"/>
+        <w:tblLook w:val="04A0" w:firstRow="1" w:lastRow="0" w:firstColumn="1" w:lastColumn="0" w:noHBand="0" w:noVBand="1"/>
       </w:tblPr>
       <w:tblGrid>
-        <w:gridCol w:w="2257"/>
-        <w:gridCol w:w="2257"/>
-        <w:gridCol w:w="2257"/>
-        <w:gridCol w:w="2257"/>
+        <w:gridCol w:w="2256"/>
+        <w:gridCol w:w="2254"/>
+        <w:gridCol w:w="2255"/>
+        <w:gridCol w:w="2255"/>
       </w:tblGrid>
       <w:tr>
         <w:tc>
           <w:tcPr>
-            <w:tcW w:type="dxa" w:w="2257"/>
+            <w:tcW w:w="2257" w:type="dxa"/>
           </w:tcPr>
           <w:p>
             <w:r>
@@ -10106,7 +10111,7 @@
         </w:tc>
         <w:tc>
           <w:tcPr>
-            <w:tcW w:type="dxa" w:w="2257"/>
+            <w:tcW w:w="2257" w:type="dxa"/>
           </w:tcPr>
           <w:p>
             <w:r>
@@ -10120,7 +10125,7 @@
         </w:tc>
         <w:tc>
           <w:tcPr>
-            <w:tcW w:type="dxa" w:w="2257"/>
+            <w:tcW w:w="2257" w:type="dxa"/>
           </w:tcPr>
           <w:p>
             <w:r>
@@ -10134,7 +10139,7 @@
         </w:tc>
         <w:tc>
           <w:tcPr>
-            <w:tcW w:type="dxa" w:w="2257"/>
+            <w:tcW w:w="2257" w:type="dxa"/>
           </w:tcPr>
           <w:p>
             <w:r>
@@ -10150,7 +10155,7 @@
       <w:tr>
         <w:tc>
           <w:tcPr>
-            <w:tcW w:type="dxa" w:w="2257"/>
+            <w:tcW w:w="2257" w:type="dxa"/>
           </w:tcPr>
           <w:p>
             <w:r>
@@ -10163,7 +10168,7 @@
         </w:tc>
         <w:tc>
           <w:tcPr>
-            <w:tcW w:type="dxa" w:w="2257"/>
+            <w:tcW w:w="2257" w:type="dxa"/>
           </w:tcPr>
           <w:p>
             <w:r>
@@ -10176,7 +10181,7 @@
         </w:tc>
         <w:tc>
           <w:tcPr>
-            <w:tcW w:type="dxa" w:w="2257"/>
+            <w:tcW w:w="2257" w:type="dxa"/>
           </w:tcPr>
           <w:p>
             <w:r>
@@ -10189,7 +10194,7 @@
         </w:tc>
         <w:tc>
           <w:tcPr>
-            <w:tcW w:type="dxa" w:w="2257"/>
+            <w:tcW w:w="2257" w:type="dxa"/>
           </w:tcPr>
           <w:p>
             <w:r>
@@ -10204,7 +10209,7 @@
       <w:tr>
         <w:tc>
           <w:tcPr>
-            <w:tcW w:type="dxa" w:w="2257"/>
+            <w:tcW w:w="2257" w:type="dxa"/>
           </w:tcPr>
           <w:p>
             <w:r>
@@ -10217,7 +10222,7 @@
         </w:tc>
         <w:tc>
           <w:tcPr>
-            <w:tcW w:type="dxa" w:w="2257"/>
+            <w:tcW w:w="2257" w:type="dxa"/>
           </w:tcPr>
           <w:p>
             <w:r>
@@ -10230,7 +10235,7 @@
         </w:tc>
         <w:tc>
           <w:tcPr>
-            <w:tcW w:type="dxa" w:w="2257"/>
+            <w:tcW w:w="2257" w:type="dxa"/>
           </w:tcPr>
           <w:p>
             <w:r>
@@ -10243,7 +10248,7 @@
         </w:tc>
         <w:tc>
           <w:tcPr>
-            <w:tcW w:type="dxa" w:w="2257"/>
+            <w:tcW w:w="2257" w:type="dxa"/>
           </w:tcPr>
           <w:p>
             <w:r>
@@ -10258,7 +10263,7 @@
       <w:tr>
         <w:tc>
           <w:tcPr>
-            <w:tcW w:type="dxa" w:w="2257"/>
+            <w:tcW w:w="2257" w:type="dxa"/>
           </w:tcPr>
           <w:p>
             <w:r>
@@ -10271,7 +10276,7 @@
         </w:tc>
         <w:tc>
           <w:tcPr>
-            <w:tcW w:type="dxa" w:w="2257"/>
+            <w:tcW w:w="2257" w:type="dxa"/>
           </w:tcPr>
           <w:p>
             <w:r>
@@ -10284,7 +10289,7 @@
         </w:tc>
         <w:tc>
           <w:tcPr>
-            <w:tcW w:type="dxa" w:w="2257"/>
+            <w:tcW w:w="2257" w:type="dxa"/>
           </w:tcPr>
           <w:p>
             <w:r>
@@ -10297,7 +10302,7 @@
         </w:tc>
         <w:tc>
           <w:tcPr>
-            <w:tcW w:type="dxa" w:w="2257"/>
+            <w:tcW w:w="2257" w:type="dxa"/>
           </w:tcPr>
           <w:p>
             <w:r>
@@ -10312,7 +10317,7 @@
       <w:tr>
         <w:tc>
           <w:tcPr>
-            <w:tcW w:type="dxa" w:w="2257"/>
+            <w:tcW w:w="2257" w:type="dxa"/>
           </w:tcPr>
           <w:p>
             <w:r>
@@ -10325,7 +10330,7 @@
         </w:tc>
         <w:tc>
           <w:tcPr>
-            <w:tcW w:type="dxa" w:w="2257"/>
+            <w:tcW w:w="2257" w:type="dxa"/>
           </w:tcPr>
           <w:p>
             <w:r>
@@ -10338,7 +10343,7 @@
         </w:tc>
         <w:tc>
           <w:tcPr>
-            <w:tcW w:type="dxa" w:w="2257"/>
+            <w:tcW w:w="2257" w:type="dxa"/>
           </w:tcPr>
           <w:p>
             <w:r>
@@ -10351,7 +10356,7 @@
         </w:tc>
         <w:tc>
           <w:tcPr>
-            <w:tcW w:type="dxa" w:w="2257"/>
+            <w:tcW w:w="2257" w:type="dxa"/>
           </w:tcPr>
           <w:p>
             <w:r>
@@ -10366,7 +10371,7 @@
       <w:tr>
         <w:tc>
           <w:tcPr>
-            <w:tcW w:type="dxa" w:w="2257"/>
+            <w:tcW w:w="2257" w:type="dxa"/>
           </w:tcPr>
           <w:p>
             <w:r>
@@ -10379,7 +10384,7 @@
         </w:tc>
         <w:tc>
           <w:tcPr>
-            <w:tcW w:type="dxa" w:w="2257"/>
+            <w:tcW w:w="2257" w:type="dxa"/>
           </w:tcPr>
           <w:p>
             <w:r>
@@ -10392,7 +10397,7 @@
         </w:tc>
         <w:tc>
           <w:tcPr>
-            <w:tcW w:type="dxa" w:w="2257"/>
+            <w:tcW w:w="2257" w:type="dxa"/>
           </w:tcPr>
           <w:p>
             <w:r>
@@ -10405,7 +10410,7 @@
         </w:tc>
         <w:tc>
           <w:tcPr>
-            <w:tcW w:type="dxa" w:w="2257"/>
+            <w:tcW w:w="2257" w:type="dxa"/>
           </w:tcPr>
           <w:p>
             <w:r>
@@ -10420,7 +10425,7 @@
       <w:tr>
         <w:tc>
           <w:tcPr>
-            <w:tcW w:type="dxa" w:w="2257"/>
+            <w:tcW w:w="2257" w:type="dxa"/>
           </w:tcPr>
           <w:p>
             <w:r>
@@ -10433,7 +10438,7 @@
         </w:tc>
         <w:tc>
           <w:tcPr>
-            <w:tcW w:type="dxa" w:w="2257"/>
+            <w:tcW w:w="2257" w:type="dxa"/>
           </w:tcPr>
           <w:p>
             <w:r>
@@ -10446,7 +10451,7 @@
         </w:tc>
         <w:tc>
           <w:tcPr>
-            <w:tcW w:type="dxa" w:w="2257"/>
+            <w:tcW w:w="2257" w:type="dxa"/>
           </w:tcPr>
           <w:p>
             <w:r>
@@ -10459,7 +10464,7 @@
         </w:tc>
         <w:tc>
           <w:tcPr>
-            <w:tcW w:type="dxa" w:w="2257"/>
+            <w:tcW w:w="2257" w:type="dxa"/>
           </w:tcPr>
           <w:p>
             <w:r>
@@ -10474,20 +10479,21 @@
       <w:tr>
         <w:tc>
           <w:tcPr>
-            <w:tcW w:type="dxa" w:w="2257"/>
-          </w:tcPr>
-          <w:p>
-            <w:r>
-              <w:rPr>
-                <w:sz w:val="19"/>
-              </w:rPr>
+            <w:tcW w:w="2257" w:type="dxa"/>
+          </w:tcPr>
+          <w:p>
+            <w:r>
+              <w:rPr>
+                <w:sz w:val="19"/>
+              </w:rPr>
+              <w:lastRenderedPageBreak/>
               <w:t>department</w:t>
             </w:r>
           </w:p>
         </w:tc>
         <w:tc>
           <w:tcPr>
-            <w:tcW w:type="dxa" w:w="2257"/>
+            <w:tcW w:w="2257" w:type="dxa"/>
           </w:tcPr>
           <w:p>
             <w:r>
@@ -10500,7 +10506,7 @@
         </w:tc>
         <w:tc>
           <w:tcPr>
-            <w:tcW w:type="dxa" w:w="2257"/>
+            <w:tcW w:w="2257" w:type="dxa"/>
           </w:tcPr>
           <w:p>
             <w:r>
@@ -10513,7 +10519,7 @@
         </w:tc>
         <w:tc>
           <w:tcPr>
-            <w:tcW w:type="dxa" w:w="2257"/>
+            <w:tcW w:w="2257" w:type="dxa"/>
           </w:tcPr>
           <w:p>
             <w:r>
@@ -10528,7 +10534,7 @@
       <w:tr>
         <w:tc>
           <w:tcPr>
-            <w:tcW w:type="dxa" w:w="2257"/>
+            <w:tcW w:w="2257" w:type="dxa"/>
           </w:tcPr>
           <w:p>
             <w:r>
@@ -10541,7 +10547,7 @@
         </w:tc>
         <w:tc>
           <w:tcPr>
-            <w:tcW w:type="dxa" w:w="2257"/>
+            <w:tcW w:w="2257" w:type="dxa"/>
           </w:tcPr>
           <w:p>
             <w:r>
@@ -10554,7 +10560,7 @@
         </w:tc>
         <w:tc>
           <w:tcPr>
-            <w:tcW w:type="dxa" w:w="2257"/>
+            <w:tcW w:w="2257" w:type="dxa"/>
           </w:tcPr>
           <w:p>
             <w:r>
@@ -10567,7 +10573,7 @@
         </w:tc>
         <w:tc>
           <w:tcPr>
-            <w:tcW w:type="dxa" w:w="2257"/>
+            <w:tcW w:w="2257" w:type="dxa"/>
           </w:tcPr>
           <w:p>
             <w:r>
@@ -10582,7 +10588,7 @@
       <w:tr>
         <w:tc>
           <w:tcPr>
-            <w:tcW w:type="dxa" w:w="2257"/>
+            <w:tcW w:w="2257" w:type="dxa"/>
           </w:tcPr>
           <w:p>
             <w:r>
@@ -10595,7 +10601,7 @@
         </w:tc>
         <w:tc>
           <w:tcPr>
-            <w:tcW w:type="dxa" w:w="2257"/>
+            <w:tcW w:w="2257" w:type="dxa"/>
           </w:tcPr>
           <w:p>
             <w:r>
@@ -10608,7 +10614,7 @@
         </w:tc>
         <w:tc>
           <w:tcPr>
-            <w:tcW w:type="dxa" w:w="2257"/>
+            <w:tcW w:w="2257" w:type="dxa"/>
           </w:tcPr>
           <w:p>
             <w:r>
@@ -10621,7 +10627,7 @@
         </w:tc>
         <w:tc>
           <w:tcPr>
-            <w:tcW w:type="dxa" w:w="2257"/>
+            <w:tcW w:w="2257" w:type="dxa"/>
           </w:tcPr>
           <w:p>
             <w:r>
@@ -10636,7 +10642,7 @@
       <w:tr>
         <w:tc>
           <w:tcPr>
-            <w:tcW w:type="dxa" w:w="2257"/>
+            <w:tcW w:w="2257" w:type="dxa"/>
           </w:tcPr>
           <w:p>
             <w:r>
@@ -10649,7 +10655,7 @@
         </w:tc>
         <w:tc>
           <w:tcPr>
-            <w:tcW w:type="dxa" w:w="2257"/>
+            <w:tcW w:w="2257" w:type="dxa"/>
           </w:tcPr>
           <w:p>
             <w:r>
@@ -10662,7 +10668,7 @@
         </w:tc>
         <w:tc>
           <w:tcPr>
-            <w:tcW w:type="dxa" w:w="2257"/>
+            <w:tcW w:w="2257" w:type="dxa"/>
           </w:tcPr>
           <w:p>
             <w:r>
@@ -10675,7 +10681,7 @@
         </w:tc>
         <w:tc>
           <w:tcPr>
-            <w:tcW w:type="dxa" w:w="2257"/>
+            <w:tcW w:w="2257" w:type="dxa"/>
           </w:tcPr>
           <w:p>
             <w:r>
@@ -10690,7 +10696,7 @@
       <w:tr>
         <w:tc>
           <w:tcPr>
-            <w:tcW w:type="dxa" w:w="2257"/>
+            <w:tcW w:w="2257" w:type="dxa"/>
           </w:tcPr>
           <w:p>
             <w:r>
@@ -10703,7 +10709,7 @@
         </w:tc>
         <w:tc>
           <w:tcPr>
-            <w:tcW w:type="dxa" w:w="2257"/>
+            <w:tcW w:w="2257" w:type="dxa"/>
           </w:tcPr>
           <w:p>
             <w:r>
@@ -10716,7 +10722,7 @@
         </w:tc>
         <w:tc>
           <w:tcPr>
-            <w:tcW w:type="dxa" w:w="2257"/>
+            <w:tcW w:w="2257" w:type="dxa"/>
           </w:tcPr>
           <w:p>
             <w:r>
@@ -10729,7 +10735,7 @@
         </w:tc>
         <w:tc>
           <w:tcPr>
-            <w:tcW w:type="dxa" w:w="2257"/>
+            <w:tcW w:w="2257" w:type="dxa"/>
           </w:tcPr>
           <w:p>
             <w:r>
@@ -10744,7 +10750,7 @@
       <w:tr>
         <w:tc>
           <w:tcPr>
-            <w:tcW w:type="dxa" w:w="2257"/>
+            <w:tcW w:w="2257" w:type="dxa"/>
           </w:tcPr>
           <w:p>
             <w:r>
@@ -10757,7 +10763,7 @@
         </w:tc>
         <w:tc>
           <w:tcPr>
-            <w:tcW w:type="dxa" w:w="2257"/>
+            <w:tcW w:w="2257" w:type="dxa"/>
           </w:tcPr>
           <w:p>
             <w:r>
@@ -10770,7 +10776,7 @@
         </w:tc>
         <w:tc>
           <w:tcPr>
-            <w:tcW w:type="dxa" w:w="2257"/>
+            <w:tcW w:w="2257" w:type="dxa"/>
           </w:tcPr>
           <w:p>
             <w:r>
@@ -10783,7 +10789,7 @@
         </w:tc>
         <w:tc>
           <w:tcPr>
-            <w:tcW w:type="dxa" w:w="2257"/>
+            <w:tcW w:w="2257" w:type="dxa"/>
           </w:tcPr>
           <w:p>
             <w:r>
@@ -10798,7 +10804,7 @@
       <w:tr>
         <w:tc>
           <w:tcPr>
-            <w:tcW w:type="dxa" w:w="2257"/>
+            <w:tcW w:w="2257" w:type="dxa"/>
           </w:tcPr>
           <w:p>
             <w:r>
@@ -10811,7 +10817,7 @@
         </w:tc>
         <w:tc>
           <w:tcPr>
-            <w:tcW w:type="dxa" w:w="2257"/>
+            <w:tcW w:w="2257" w:type="dxa"/>
           </w:tcPr>
           <w:p>
             <w:r>
@@ -10824,7 +10830,7 @@
         </w:tc>
         <w:tc>
           <w:tcPr>
-            <w:tcW w:type="dxa" w:w="2257"/>
+            <w:tcW w:w="2257" w:type="dxa"/>
           </w:tcPr>
           <w:p>
             <w:r>
@@ -10837,7 +10843,7 @@
         </w:tc>
         <w:tc>
           <w:tcPr>
-            <w:tcW w:type="dxa" w:w="2257"/>
+            <w:tcW w:w="2257" w:type="dxa"/>
           </w:tcPr>
           <w:p>
             <w:r>
@@ -10852,7 +10858,7 @@
       <w:tr>
         <w:tc>
           <w:tcPr>
-            <w:tcW w:type="dxa" w:w="2257"/>
+            <w:tcW w:w="2257" w:type="dxa"/>
           </w:tcPr>
           <w:p>
             <w:r>
@@ -10865,7 +10871,7 @@
         </w:tc>
         <w:tc>
           <w:tcPr>
-            <w:tcW w:type="dxa" w:w="2257"/>
+            <w:tcW w:w="2257" w:type="dxa"/>
           </w:tcPr>
           <w:p>
             <w:r>
@@ -10878,7 +10884,7 @@
         </w:tc>
         <w:tc>
           <w:tcPr>
-            <w:tcW w:type="dxa" w:w="2257"/>
+            <w:tcW w:w="2257" w:type="dxa"/>
           </w:tcPr>
           <w:p>
             <w:r>
@@ -10891,7 +10897,7 @@
         </w:tc>
         <w:tc>
           <w:tcPr>
-            <w:tcW w:type="dxa" w:w="2257"/>
+            <w:tcW w:w="2257" w:type="dxa"/>
           </w:tcPr>
           <w:p>
             <w:r>
@@ -10920,19 +10926,19 @@
     <w:tbl>
       <w:tblPr>
         <w:tblStyle w:val="TableGrid"/>
-        <w:tblW w:type="auto" w:w="0"/>
-        <w:tblLook w:firstColumn="1" w:firstRow="1" w:lastColumn="0" w:lastRow="0" w:noHBand="0" w:noVBand="1" w:val="04A0"/>
+        <w:tblW w:w="0" w:type="auto"/>
+        <w:tblLook w:val="04A0" w:firstRow="1" w:lastRow="0" w:firstColumn="1" w:lastColumn="0" w:noHBand="0" w:noVBand="1"/>
       </w:tblPr>
       <w:tblGrid>
-        <w:gridCol w:w="2257"/>
-        <w:gridCol w:w="2257"/>
-        <w:gridCol w:w="2257"/>
-        <w:gridCol w:w="2257"/>
+        <w:gridCol w:w="2256"/>
+        <w:gridCol w:w="2254"/>
+        <w:gridCol w:w="2255"/>
+        <w:gridCol w:w="2255"/>
       </w:tblGrid>
       <w:tr>
         <w:tc>
           <w:tcPr>
-            <w:tcW w:type="dxa" w:w="2257"/>
+            <w:tcW w:w="2257" w:type="dxa"/>
           </w:tcPr>
           <w:p>
             <w:r>
@@ -10946,7 +10952,7 @@
         </w:tc>
         <w:tc>
           <w:tcPr>
-            <w:tcW w:type="dxa" w:w="2257"/>
+            <w:tcW w:w="2257" w:type="dxa"/>
           </w:tcPr>
           <w:p>
             <w:r>
@@ -10960,7 +10966,7 @@
         </w:tc>
         <w:tc>
           <w:tcPr>
-            <w:tcW w:type="dxa" w:w="2257"/>
+            <w:tcW w:w="2257" w:type="dxa"/>
           </w:tcPr>
           <w:p>
             <w:r>
@@ -10974,7 +10980,7 @@
         </w:tc>
         <w:tc>
           <w:tcPr>
-            <w:tcW w:type="dxa" w:w="2257"/>
+            <w:tcW w:w="2257" w:type="dxa"/>
           </w:tcPr>
           <w:p>
             <w:r>
@@ -10990,7 +10996,7 @@
       <w:tr>
         <w:tc>
           <w:tcPr>
-            <w:tcW w:type="dxa" w:w="2257"/>
+            <w:tcW w:w="2257" w:type="dxa"/>
           </w:tcPr>
           <w:p>
             <w:r>
@@ -11003,7 +11009,7 @@
         </w:tc>
         <w:tc>
           <w:tcPr>
-            <w:tcW w:type="dxa" w:w="2257"/>
+            <w:tcW w:w="2257" w:type="dxa"/>
           </w:tcPr>
           <w:p>
             <w:r>
@@ -11016,7 +11022,7 @@
         </w:tc>
         <w:tc>
           <w:tcPr>
-            <w:tcW w:type="dxa" w:w="2257"/>
+            <w:tcW w:w="2257" w:type="dxa"/>
           </w:tcPr>
           <w:p>
             <w:r>
@@ -11029,7 +11035,7 @@
         </w:tc>
         <w:tc>
           <w:tcPr>
-            <w:tcW w:type="dxa" w:w="2257"/>
+            <w:tcW w:w="2257" w:type="dxa"/>
           </w:tcPr>
           <w:p>
             <w:r>
@@ -11044,7 +11050,7 @@
       <w:tr>
         <w:tc>
           <w:tcPr>
-            <w:tcW w:type="dxa" w:w="2257"/>
+            <w:tcW w:w="2257" w:type="dxa"/>
           </w:tcPr>
           <w:p>
             <w:r>
@@ -11057,7 +11063,7 @@
         </w:tc>
         <w:tc>
           <w:tcPr>
-            <w:tcW w:type="dxa" w:w="2257"/>
+            <w:tcW w:w="2257" w:type="dxa"/>
           </w:tcPr>
           <w:p>
             <w:r>
@@ -11070,7 +11076,7 @@
         </w:tc>
         <w:tc>
           <w:tcPr>
-            <w:tcW w:type="dxa" w:w="2257"/>
+            <w:tcW w:w="2257" w:type="dxa"/>
           </w:tcPr>
           <w:p>
             <w:r>
@@ -11083,7 +11089,7 @@
         </w:tc>
         <w:tc>
           <w:tcPr>
-            <w:tcW w:type="dxa" w:w="2257"/>
+            <w:tcW w:w="2257" w:type="dxa"/>
           </w:tcPr>
           <w:p>
             <w:r>
@@ -11098,7 +11104,7 @@
       <w:tr>
         <w:tc>
           <w:tcPr>
-            <w:tcW w:type="dxa" w:w="2257"/>
+            <w:tcW w:w="2257" w:type="dxa"/>
           </w:tcPr>
           <w:p>
             <w:r>
@@ -11111,7 +11117,7 @@
         </w:tc>
         <w:tc>
           <w:tcPr>
-            <w:tcW w:type="dxa" w:w="2257"/>
+            <w:tcW w:w="2257" w:type="dxa"/>
           </w:tcPr>
           <w:p>
             <w:r>
@@ -11124,7 +11130,7 @@
         </w:tc>
         <w:tc>
           <w:tcPr>
-            <w:tcW w:type="dxa" w:w="2257"/>
+            <w:tcW w:w="2257" w:type="dxa"/>
           </w:tcPr>
           <w:p>
             <w:r>
@@ -11137,7 +11143,7 @@
         </w:tc>
         <w:tc>
           <w:tcPr>
-            <w:tcW w:type="dxa" w:w="2257"/>
+            <w:tcW w:w="2257" w:type="dxa"/>
           </w:tcPr>
           <w:p>
             <w:r>
@@ -11152,7 +11158,7 @@
       <w:tr>
         <w:tc>
           <w:tcPr>
-            <w:tcW w:type="dxa" w:w="2257"/>
+            <w:tcW w:w="2257" w:type="dxa"/>
           </w:tcPr>
           <w:p>
             <w:r>
@@ -11165,7 +11171,7 @@
         </w:tc>
         <w:tc>
           <w:tcPr>
-            <w:tcW w:type="dxa" w:w="2257"/>
+            <w:tcW w:w="2257" w:type="dxa"/>
           </w:tcPr>
           <w:p>
             <w:r>
@@ -11178,7 +11184,7 @@
         </w:tc>
         <w:tc>
           <w:tcPr>
-            <w:tcW w:type="dxa" w:w="2257"/>
+            <w:tcW w:w="2257" w:type="dxa"/>
           </w:tcPr>
           <w:p>
             <w:r>
@@ -11191,7 +11197,7 @@
         </w:tc>
         <w:tc>
           <w:tcPr>
-            <w:tcW w:type="dxa" w:w="2257"/>
+            <w:tcW w:w="2257" w:type="dxa"/>
           </w:tcPr>
           <w:p>
             <w:r>
@@ -11206,7 +11212,7 @@
       <w:tr>
         <w:tc>
           <w:tcPr>
-            <w:tcW w:type="dxa" w:w="2257"/>
+            <w:tcW w:w="2257" w:type="dxa"/>
           </w:tcPr>
           <w:p>
             <w:r>
@@ -11219,7 +11225,7 @@
         </w:tc>
         <w:tc>
           <w:tcPr>
-            <w:tcW w:type="dxa" w:w="2257"/>
+            <w:tcW w:w="2257" w:type="dxa"/>
           </w:tcPr>
           <w:p>
             <w:r>
@@ -11232,7 +11238,7 @@
         </w:tc>
         <w:tc>
           <w:tcPr>
-            <w:tcW w:type="dxa" w:w="2257"/>
+            <w:tcW w:w="2257" w:type="dxa"/>
           </w:tcPr>
           <w:p>
             <w:r>
@@ -11245,7 +11251,7 @@
         </w:tc>
         <w:tc>
           <w:tcPr>
-            <w:tcW w:type="dxa" w:w="2257"/>
+            <w:tcW w:w="2257" w:type="dxa"/>
           </w:tcPr>
           <w:p>
             <w:r>
@@ -11260,7 +11266,7 @@
       <w:tr>
         <w:tc>
           <w:tcPr>
-            <w:tcW w:type="dxa" w:w="2257"/>
+            <w:tcW w:w="2257" w:type="dxa"/>
           </w:tcPr>
           <w:p>
             <w:r>
@@ -11273,7 +11279,7 @@
         </w:tc>
         <w:tc>
           <w:tcPr>
-            <w:tcW w:type="dxa" w:w="2257"/>
+            <w:tcW w:w="2257" w:type="dxa"/>
           </w:tcPr>
           <w:p>
             <w:r>
@@ -11286,7 +11292,7 @@
         </w:tc>
         <w:tc>
           <w:tcPr>
-            <w:tcW w:type="dxa" w:w="2257"/>
+            <w:tcW w:w="2257" w:type="dxa"/>
           </w:tcPr>
           <w:p>
             <w:r>
@@ -11299,7 +11305,7 @@
         </w:tc>
         <w:tc>
           <w:tcPr>
-            <w:tcW w:type="dxa" w:w="2257"/>
+            <w:tcW w:w="2257" w:type="dxa"/>
           </w:tcPr>
           <w:p>
             <w:r>
@@ -11314,7 +11320,7 @@
       <w:tr>
         <w:tc>
           <w:tcPr>
-            <w:tcW w:type="dxa" w:w="2257"/>
+            <w:tcW w:w="2257" w:type="dxa"/>
           </w:tcPr>
           <w:p>
             <w:r>
@@ -11327,7 +11333,7 @@
         </w:tc>
         <w:tc>
           <w:tcPr>
-            <w:tcW w:type="dxa" w:w="2257"/>
+            <w:tcW w:w="2257" w:type="dxa"/>
           </w:tcPr>
           <w:p>
             <w:r>
@@ -11340,7 +11346,7 @@
         </w:tc>
         <w:tc>
           <w:tcPr>
-            <w:tcW w:type="dxa" w:w="2257"/>
+            <w:tcW w:w="2257" w:type="dxa"/>
           </w:tcPr>
           <w:p>
             <w:r>
@@ -11353,7 +11359,7 @@
         </w:tc>
         <w:tc>
           <w:tcPr>
-            <w:tcW w:type="dxa" w:w="2257"/>
+            <w:tcW w:w="2257" w:type="dxa"/>
           </w:tcPr>
           <w:p>
             <w:r>
@@ -11368,7 +11374,7 @@
       <w:tr>
         <w:tc>
           <w:tcPr>
-            <w:tcW w:type="dxa" w:w="2257"/>
+            <w:tcW w:w="2257" w:type="dxa"/>
           </w:tcPr>
           <w:p>
             <w:r>
@@ -11381,7 +11387,7 @@
         </w:tc>
         <w:tc>
           <w:tcPr>
-            <w:tcW w:type="dxa" w:w="2257"/>
+            <w:tcW w:w="2257" w:type="dxa"/>
           </w:tcPr>
           <w:p>
             <w:r>
@@ -11394,7 +11400,7 @@
         </w:tc>
         <w:tc>
           <w:tcPr>
-            <w:tcW w:type="dxa" w:w="2257"/>
+            <w:tcW w:w="2257" w:type="dxa"/>
           </w:tcPr>
           <w:p>
             <w:r>
@@ -11407,7 +11413,7 @@
         </w:tc>
         <w:tc>
           <w:tcPr>
-            <w:tcW w:type="dxa" w:w="2257"/>
+            <w:tcW w:w="2257" w:type="dxa"/>
           </w:tcPr>
           <w:p>
             <w:r>
@@ -11436,19 +11442,19 @@
     <w:tbl>
       <w:tblPr>
         <w:tblStyle w:val="TableGrid"/>
-        <w:tblW w:type="auto" w:w="0"/>
-        <w:tblLook w:firstColumn="1" w:firstRow="1" w:lastColumn="0" w:lastRow="0" w:noHBand="0" w:noVBand="1" w:val="04A0"/>
+        <w:tblW w:w="0" w:type="auto"/>
+        <w:tblLook w:val="04A0" w:firstRow="1" w:lastRow="0" w:firstColumn="1" w:lastColumn="0" w:noHBand="0" w:noVBand="1"/>
       </w:tblPr>
       <w:tblGrid>
-        <w:gridCol w:w="2257"/>
-        <w:gridCol w:w="2257"/>
-        <w:gridCol w:w="2257"/>
-        <w:gridCol w:w="2257"/>
+        <w:gridCol w:w="2256"/>
+        <w:gridCol w:w="2254"/>
+        <w:gridCol w:w="2255"/>
+        <w:gridCol w:w="2255"/>
       </w:tblGrid>
       <w:tr>
         <w:tc>
           <w:tcPr>
-            <w:tcW w:type="dxa" w:w="2257"/>
+            <w:tcW w:w="2257" w:type="dxa"/>
           </w:tcPr>
           <w:p>
             <w:r>
@@ -11462,7 +11468,7 @@
         </w:tc>
         <w:tc>
           <w:tcPr>
-            <w:tcW w:type="dxa" w:w="2257"/>
+            <w:tcW w:w="2257" w:type="dxa"/>
           </w:tcPr>
           <w:p>
             <w:r>
@@ -11476,7 +11482,7 @@
         </w:tc>
         <w:tc>
           <w:tcPr>
-            <w:tcW w:type="dxa" w:w="2257"/>
+            <w:tcW w:w="2257" w:type="dxa"/>
           </w:tcPr>
           <w:p>
             <w:r>
@@ -11490,7 +11496,7 @@
         </w:tc>
         <w:tc>
           <w:tcPr>
-            <w:tcW w:type="dxa" w:w="2257"/>
+            <w:tcW w:w="2257" w:type="dxa"/>
           </w:tcPr>
           <w:p>
             <w:r>
@@ -11506,7 +11512,7 @@
       <w:tr>
         <w:tc>
           <w:tcPr>
-            <w:tcW w:type="dxa" w:w="2257"/>
+            <w:tcW w:w="2257" w:type="dxa"/>
           </w:tcPr>
           <w:p>
             <w:r>
@@ -11519,7 +11525,7 @@
         </w:tc>
         <w:tc>
           <w:tcPr>
-            <w:tcW w:type="dxa" w:w="2257"/>
+            <w:tcW w:w="2257" w:type="dxa"/>
           </w:tcPr>
           <w:p>
             <w:r>
@@ -11532,7 +11538,7 @@
         </w:tc>
         <w:tc>
           <w:tcPr>
-            <w:tcW w:type="dxa" w:w="2257"/>
+            <w:tcW w:w="2257" w:type="dxa"/>
           </w:tcPr>
           <w:p>
             <w:r>
@@ -11545,7 +11551,7 @@
         </w:tc>
         <w:tc>
           <w:tcPr>
-            <w:tcW w:type="dxa" w:w="2257"/>
+            <w:tcW w:w="2257" w:type="dxa"/>
           </w:tcPr>
           <w:p>
             <w:r>
@@ -11560,7 +11566,7 @@
       <w:tr>
         <w:tc>
           <w:tcPr>
-            <w:tcW w:type="dxa" w:w="2257"/>
+            <w:tcW w:w="2257" w:type="dxa"/>
           </w:tcPr>
           <w:p>
             <w:r>
@@ -11573,7 +11579,7 @@
         </w:tc>
         <w:tc>
           <w:tcPr>
-            <w:tcW w:type="dxa" w:w="2257"/>
+            <w:tcW w:w="2257" w:type="dxa"/>
           </w:tcPr>
           <w:p>
             <w:r>
@@ -11586,7 +11592,7 @@
         </w:tc>
         <w:tc>
           <w:tcPr>
-            <w:tcW w:type="dxa" w:w="2257"/>
+            <w:tcW w:w="2257" w:type="dxa"/>
           </w:tcPr>
           <w:p>
             <w:r>
@@ -11599,7 +11605,7 @@
         </w:tc>
         <w:tc>
           <w:tcPr>
-            <w:tcW w:type="dxa" w:w="2257"/>
+            <w:tcW w:w="2257" w:type="dxa"/>
           </w:tcPr>
           <w:p>
             <w:r>
@@ -11614,7 +11620,7 @@
       <w:tr>
         <w:tc>
           <w:tcPr>
-            <w:tcW w:type="dxa" w:w="2257"/>
+            <w:tcW w:w="2257" w:type="dxa"/>
           </w:tcPr>
           <w:p>
             <w:r>
@@ -11627,7 +11633,7 @@
         </w:tc>
         <w:tc>
           <w:tcPr>
-            <w:tcW w:type="dxa" w:w="2257"/>
+            <w:tcW w:w="2257" w:type="dxa"/>
           </w:tcPr>
           <w:p>
             <w:r>
@@ -11640,7 +11646,7 @@
         </w:tc>
         <w:tc>
           <w:tcPr>
-            <w:tcW w:type="dxa" w:w="2257"/>
+            <w:tcW w:w="2257" w:type="dxa"/>
           </w:tcPr>
           <w:p>
             <w:r>
@@ -11653,7 +11659,7 @@
         </w:tc>
         <w:tc>
           <w:tcPr>
-            <w:tcW w:type="dxa" w:w="2257"/>
+            <w:tcW w:w="2257" w:type="dxa"/>
           </w:tcPr>
           <w:p>
             <w:r>
@@ -11668,7 +11674,7 @@
       <w:tr>
         <w:tc>
           <w:tcPr>
-            <w:tcW w:type="dxa" w:w="2257"/>
+            <w:tcW w:w="2257" w:type="dxa"/>
           </w:tcPr>
           <w:p>
             <w:r>
@@ -11681,7 +11687,7 @@
         </w:tc>
         <w:tc>
           <w:tcPr>
-            <w:tcW w:type="dxa" w:w="2257"/>
+            <w:tcW w:w="2257" w:type="dxa"/>
           </w:tcPr>
           <w:p>
             <w:r>
@@ -11694,7 +11700,7 @@
         </w:tc>
         <w:tc>
           <w:tcPr>
-            <w:tcW w:type="dxa" w:w="2257"/>
+            <w:tcW w:w="2257" w:type="dxa"/>
           </w:tcPr>
           <w:p>
             <w:r>
@@ -11707,7 +11713,7 @@
         </w:tc>
         <w:tc>
           <w:tcPr>
-            <w:tcW w:type="dxa" w:w="2257"/>
+            <w:tcW w:w="2257" w:type="dxa"/>
           </w:tcPr>
           <w:p>
             <w:r>
@@ -11736,19 +11742,19 @@
     <w:tbl>
       <w:tblPr>
         <w:tblStyle w:val="TableGrid"/>
-        <w:tblW w:type="auto" w:w="0"/>
-        <w:tblLook w:firstColumn="1" w:firstRow="1" w:lastColumn="0" w:lastRow="0" w:noHBand="0" w:noVBand="1" w:val="04A0"/>
+        <w:tblW w:w="0" w:type="auto"/>
+        <w:tblLook w:val="04A0" w:firstRow="1" w:lastRow="0" w:firstColumn="1" w:lastColumn="0" w:noHBand="0" w:noVBand="1"/>
       </w:tblPr>
       <w:tblGrid>
-        <w:gridCol w:w="2257"/>
-        <w:gridCol w:w="2257"/>
-        <w:gridCol w:w="2257"/>
-        <w:gridCol w:w="2257"/>
+        <w:gridCol w:w="2255"/>
+        <w:gridCol w:w="2254"/>
+        <w:gridCol w:w="2256"/>
+        <w:gridCol w:w="2255"/>
       </w:tblGrid>
       <w:tr>
         <w:tc>
           <w:tcPr>
-            <w:tcW w:type="dxa" w:w="2257"/>
+            <w:tcW w:w="2257" w:type="dxa"/>
           </w:tcPr>
           <w:p>
             <w:r>
@@ -11762,7 +11768,7 @@
         </w:tc>
         <w:tc>
           <w:tcPr>
-            <w:tcW w:type="dxa" w:w="2257"/>
+            <w:tcW w:w="2257" w:type="dxa"/>
           </w:tcPr>
           <w:p>
             <w:r>
@@ -11776,7 +11782,7 @@
         </w:tc>
         <w:tc>
           <w:tcPr>
-            <w:tcW w:type="dxa" w:w="2257"/>
+            <w:tcW w:w="2257" w:type="dxa"/>
           </w:tcPr>
           <w:p>
             <w:r>
@@ -11790,7 +11796,7 @@
         </w:tc>
         <w:tc>
           <w:tcPr>
-            <w:tcW w:type="dxa" w:w="2257"/>
+            <w:tcW w:w="2257" w:type="dxa"/>
           </w:tcPr>
           <w:p>
             <w:r>
@@ -11806,7 +11812,7 @@
       <w:tr>
         <w:tc>
           <w:tcPr>
-            <w:tcW w:type="dxa" w:w="2257"/>
+            <w:tcW w:w="2257" w:type="dxa"/>
           </w:tcPr>
           <w:p>
             <w:r>
@@ -11819,7 +11825,7 @@
         </w:tc>
         <w:tc>
           <w:tcPr>
-            <w:tcW w:type="dxa" w:w="2257"/>
+            <w:tcW w:w="2257" w:type="dxa"/>
           </w:tcPr>
           <w:p>
             <w:r>
@@ -11832,7 +11838,7 @@
         </w:tc>
         <w:tc>
           <w:tcPr>
-            <w:tcW w:type="dxa" w:w="2257"/>
+            <w:tcW w:w="2257" w:type="dxa"/>
           </w:tcPr>
           <w:p>
             <w:r>
@@ -11845,7 +11851,7 @@
         </w:tc>
         <w:tc>
           <w:tcPr>
-            <w:tcW w:type="dxa" w:w="2257"/>
+            <w:tcW w:w="2257" w:type="dxa"/>
           </w:tcPr>
           <w:p>
             <w:r>
@@ -11860,20 +11866,21 @@
       <w:tr>
         <w:tc>
           <w:tcPr>
-            <w:tcW w:type="dxa" w:w="2257"/>
-          </w:tcPr>
-          <w:p>
-            <w:r>
-              <w:rPr>
-                <w:sz w:val="19"/>
-              </w:rPr>
+            <w:tcW w:w="2257" w:type="dxa"/>
+          </w:tcPr>
+          <w:p>
+            <w:r>
+              <w:rPr>
+                <w:sz w:val="19"/>
+              </w:rPr>
+              <w:lastRenderedPageBreak/>
               <w:t>action</w:t>
             </w:r>
           </w:p>
         </w:tc>
         <w:tc>
           <w:tcPr>
-            <w:tcW w:type="dxa" w:w="2257"/>
+            <w:tcW w:w="2257" w:type="dxa"/>
           </w:tcPr>
           <w:p>
             <w:r>
@@ -11886,7 +11893,7 @@
         </w:tc>
         <w:tc>
           <w:tcPr>
-            <w:tcW w:type="dxa" w:w="2257"/>
+            <w:tcW w:w="2257" w:type="dxa"/>
           </w:tcPr>
           <w:p>
             <w:r>
@@ -11899,7 +11906,7 @@
         </w:tc>
         <w:tc>
           <w:tcPr>
-            <w:tcW w:type="dxa" w:w="2257"/>
+            <w:tcW w:w="2257" w:type="dxa"/>
           </w:tcPr>
           <w:p>
             <w:r>
@@ -11914,7 +11921,7 @@
       <w:tr>
         <w:tc>
           <w:tcPr>
-            <w:tcW w:type="dxa" w:w="2257"/>
+            <w:tcW w:w="2257" w:type="dxa"/>
           </w:tcPr>
           <w:p>
             <w:r>
@@ -11927,7 +11934,7 @@
         </w:tc>
         <w:tc>
           <w:tcPr>
-            <w:tcW w:type="dxa" w:w="2257"/>
+            <w:tcW w:w="2257" w:type="dxa"/>
           </w:tcPr>
           <w:p>
             <w:r>
@@ -11940,7 +11947,7 @@
         </w:tc>
         <w:tc>
           <w:tcPr>
-            <w:tcW w:type="dxa" w:w="2257"/>
+            <w:tcW w:w="2257" w:type="dxa"/>
           </w:tcPr>
           <w:p>
             <w:r>
@@ -11953,7 +11960,7 @@
         </w:tc>
         <w:tc>
           <w:tcPr>
-            <w:tcW w:type="dxa" w:w="2257"/>
+            <w:tcW w:w="2257" w:type="dxa"/>
           </w:tcPr>
           <w:p>
             <w:r>
@@ -11968,7 +11975,7 @@
       <w:tr>
         <w:tc>
           <w:tcPr>
-            <w:tcW w:type="dxa" w:w="2257"/>
+            <w:tcW w:w="2257" w:type="dxa"/>
           </w:tcPr>
           <w:p>
             <w:r>
@@ -11981,7 +11988,7 @@
         </w:tc>
         <w:tc>
           <w:tcPr>
-            <w:tcW w:type="dxa" w:w="2257"/>
+            <w:tcW w:w="2257" w:type="dxa"/>
           </w:tcPr>
           <w:p>
             <w:r>
@@ -11994,7 +12001,7 @@
         </w:tc>
         <w:tc>
           <w:tcPr>
-            <w:tcW w:type="dxa" w:w="2257"/>
+            <w:tcW w:w="2257" w:type="dxa"/>
           </w:tcPr>
           <w:p>
             <w:r>
@@ -12007,7 +12014,7 @@
         </w:tc>
         <w:tc>
           <w:tcPr>
-            <w:tcW w:type="dxa" w:w="2257"/>
+            <w:tcW w:w="2257" w:type="dxa"/>
           </w:tcPr>
           <w:p>
             <w:r>
@@ -12022,7 +12029,7 @@
       <w:tr>
         <w:tc>
           <w:tcPr>
-            <w:tcW w:type="dxa" w:w="2257"/>
+            <w:tcW w:w="2257" w:type="dxa"/>
           </w:tcPr>
           <w:p>
             <w:r>
@@ -12035,7 +12042,7 @@
         </w:tc>
         <w:tc>
           <w:tcPr>
-            <w:tcW w:type="dxa" w:w="2257"/>
+            <w:tcW w:w="2257" w:type="dxa"/>
           </w:tcPr>
           <w:p>
             <w:r>
@@ -12048,7 +12055,7 @@
         </w:tc>
         <w:tc>
           <w:tcPr>
-            <w:tcW w:type="dxa" w:w="2257"/>
+            <w:tcW w:w="2257" w:type="dxa"/>
           </w:tcPr>
           <w:p>
             <w:r>
@@ -12061,7 +12068,7 @@
         </w:tc>
         <w:tc>
           <w:tcPr>
-            <w:tcW w:type="dxa" w:w="2257"/>
+            <w:tcW w:w="2257" w:type="dxa"/>
           </w:tcPr>
           <w:p>
             <w:r>
@@ -12076,7 +12083,7 @@
       <w:tr>
         <w:tc>
           <w:tcPr>
-            <w:tcW w:type="dxa" w:w="2257"/>
+            <w:tcW w:w="2257" w:type="dxa"/>
           </w:tcPr>
           <w:p>
             <w:r>
@@ -12089,7 +12096,7 @@
         </w:tc>
         <w:tc>
           <w:tcPr>
-            <w:tcW w:type="dxa" w:w="2257"/>
+            <w:tcW w:w="2257" w:type="dxa"/>
           </w:tcPr>
           <w:p>
             <w:r>
@@ -12102,7 +12109,7 @@
         </w:tc>
         <w:tc>
           <w:tcPr>
-            <w:tcW w:type="dxa" w:w="2257"/>
+            <w:tcW w:w="2257" w:type="dxa"/>
           </w:tcPr>
           <w:p>
             <w:r>
@@ -12115,7 +12122,7 @@
         </w:tc>
         <w:tc>
           <w:tcPr>
-            <w:tcW w:type="dxa" w:w="2257"/>
+            <w:tcW w:w="2257" w:type="dxa"/>
           </w:tcPr>
           <w:p>
             <w:r>
@@ -12144,19 +12151,19 @@
     <w:tbl>
       <w:tblPr>
         <w:tblStyle w:val="TableGrid"/>
-        <w:tblW w:type="auto" w:w="0"/>
-        <w:tblLook w:firstColumn="1" w:firstRow="1" w:lastColumn="0" w:lastRow="0" w:noHBand="0" w:noVBand="1" w:val="04A0"/>
+        <w:tblW w:w="0" w:type="auto"/>
+        <w:tblLook w:val="04A0" w:firstRow="1" w:lastRow="0" w:firstColumn="1" w:lastColumn="0" w:noHBand="0" w:noVBand="1"/>
       </w:tblPr>
       <w:tblGrid>
-        <w:gridCol w:w="2257"/>
-        <w:gridCol w:w="2257"/>
-        <w:gridCol w:w="2257"/>
-        <w:gridCol w:w="2257"/>
+        <w:gridCol w:w="2254"/>
+        <w:gridCol w:w="2255"/>
+        <w:gridCol w:w="2255"/>
+        <w:gridCol w:w="2256"/>
       </w:tblGrid>
       <w:tr>
         <w:tc>
           <w:tcPr>
-            <w:tcW w:type="dxa" w:w="2257"/>
+            <w:tcW w:w="2257" w:type="dxa"/>
           </w:tcPr>
           <w:p>
             <w:r>
@@ -12170,7 +12177,7 @@
         </w:tc>
         <w:tc>
           <w:tcPr>
-            <w:tcW w:type="dxa" w:w="2257"/>
+            <w:tcW w:w="2257" w:type="dxa"/>
           </w:tcPr>
           <w:p>
             <w:r>
@@ -12184,7 +12191,7 @@
         </w:tc>
         <w:tc>
           <w:tcPr>
-            <w:tcW w:type="dxa" w:w="2257"/>
+            <w:tcW w:w="2257" w:type="dxa"/>
           </w:tcPr>
           <w:p>
             <w:r>
@@ -12198,7 +12205,7 @@
         </w:tc>
         <w:tc>
           <w:tcPr>
-            <w:tcW w:type="dxa" w:w="2257"/>
+            <w:tcW w:w="2257" w:type="dxa"/>
           </w:tcPr>
           <w:p>
             <w:r>
@@ -12214,7 +12221,7 @@
       <w:tr>
         <w:tc>
           <w:tcPr>
-            <w:tcW w:type="dxa" w:w="2257"/>
+            <w:tcW w:w="2257" w:type="dxa"/>
           </w:tcPr>
           <w:p>
             <w:r>
@@ -12227,7 +12234,7 @@
         </w:tc>
         <w:tc>
           <w:tcPr>
-            <w:tcW w:type="dxa" w:w="2257"/>
+            <w:tcW w:w="2257" w:type="dxa"/>
           </w:tcPr>
           <w:p>
             <w:r>
@@ -12240,7 +12247,7 @@
         </w:tc>
         <w:tc>
           <w:tcPr>
-            <w:tcW w:type="dxa" w:w="2257"/>
+            <w:tcW w:w="2257" w:type="dxa"/>
           </w:tcPr>
           <w:p>
             <w:r>
@@ -12253,7 +12260,7 @@
         </w:tc>
         <w:tc>
           <w:tcPr>
-            <w:tcW w:type="dxa" w:w="2257"/>
+            <w:tcW w:w="2257" w:type="dxa"/>
           </w:tcPr>
           <w:p>
             <w:r>
@@ -12268,7 +12275,7 @@
       <w:tr>
         <w:tc>
           <w:tcPr>
-            <w:tcW w:type="dxa" w:w="2257"/>
+            <w:tcW w:w="2257" w:type="dxa"/>
           </w:tcPr>
           <w:p>
             <w:r>
@@ -12281,7 +12288,7 @@
         </w:tc>
         <w:tc>
           <w:tcPr>
-            <w:tcW w:type="dxa" w:w="2257"/>
+            <w:tcW w:w="2257" w:type="dxa"/>
           </w:tcPr>
           <w:p>
             <w:r>
@@ -12294,7 +12301,7 @@
         </w:tc>
         <w:tc>
           <w:tcPr>
-            <w:tcW w:type="dxa" w:w="2257"/>
+            <w:tcW w:w="2257" w:type="dxa"/>
           </w:tcPr>
           <w:p>
             <w:r>
@@ -12307,7 +12314,7 @@
         </w:tc>
         <w:tc>
           <w:tcPr>
-            <w:tcW w:type="dxa" w:w="2257"/>
+            <w:tcW w:w="2257" w:type="dxa"/>
           </w:tcPr>
           <w:p>
             <w:r>
@@ -12322,7 +12329,7 @@
       <w:tr>
         <w:tc>
           <w:tcPr>
-            <w:tcW w:type="dxa" w:w="2257"/>
+            <w:tcW w:w="2257" w:type="dxa"/>
           </w:tcPr>
           <w:p>
             <w:r>
@@ -12335,7 +12342,7 @@
         </w:tc>
         <w:tc>
           <w:tcPr>
-            <w:tcW w:type="dxa" w:w="2257"/>
+            <w:tcW w:w="2257" w:type="dxa"/>
           </w:tcPr>
           <w:p>
             <w:r>
@@ -12348,7 +12355,7 @@
         </w:tc>
         <w:tc>
           <w:tcPr>
-            <w:tcW w:type="dxa" w:w="2257"/>
+            <w:tcW w:w="2257" w:type="dxa"/>
           </w:tcPr>
           <w:p>
             <w:r>
@@ -12361,7 +12368,7 @@
         </w:tc>
         <w:tc>
           <w:tcPr>
-            <w:tcW w:type="dxa" w:w="2257"/>
+            <w:tcW w:w="2257" w:type="dxa"/>
           </w:tcPr>
           <w:p>
             <w:r>
@@ -12376,7 +12383,7 @@
       <w:tr>
         <w:tc>
           <w:tcPr>
-            <w:tcW w:type="dxa" w:w="2257"/>
+            <w:tcW w:w="2257" w:type="dxa"/>
           </w:tcPr>
           <w:p>
             <w:r>
@@ -12389,7 +12396,7 @@
         </w:tc>
         <w:tc>
           <w:tcPr>
-            <w:tcW w:type="dxa" w:w="2257"/>
+            <w:tcW w:w="2257" w:type="dxa"/>
           </w:tcPr>
           <w:p>
             <w:r>
@@ -12402,7 +12409,7 @@
         </w:tc>
         <w:tc>
           <w:tcPr>
-            <w:tcW w:type="dxa" w:w="2257"/>
+            <w:tcW w:w="2257" w:type="dxa"/>
           </w:tcPr>
           <w:p>
             <w:r>
@@ -12415,7 +12422,7 @@
         </w:tc>
         <w:tc>
           <w:tcPr>
-            <w:tcW w:type="dxa" w:w="2257"/>
+            <w:tcW w:w="2257" w:type="dxa"/>
           </w:tcPr>
           <w:p>
             <w:r>
@@ -12430,7 +12437,7 @@
       <w:tr>
         <w:tc>
           <w:tcPr>
-            <w:tcW w:type="dxa" w:w="2257"/>
+            <w:tcW w:w="2257" w:type="dxa"/>
           </w:tcPr>
           <w:p>
             <w:r>
@@ -12443,7 +12450,7 @@
         </w:tc>
         <w:tc>
           <w:tcPr>
-            <w:tcW w:type="dxa" w:w="2257"/>
+            <w:tcW w:w="2257" w:type="dxa"/>
           </w:tcPr>
           <w:p>
             <w:r>
@@ -12456,7 +12463,7 @@
         </w:tc>
         <w:tc>
           <w:tcPr>
-            <w:tcW w:type="dxa" w:w="2257"/>
+            <w:tcW w:w="2257" w:type="dxa"/>
           </w:tcPr>
           <w:p>
             <w:r>
@@ -12469,7 +12476,7 @@
         </w:tc>
         <w:tc>
           <w:tcPr>
-            <w:tcW w:type="dxa" w:w="2257"/>
+            <w:tcW w:w="2257" w:type="dxa"/>
           </w:tcPr>
           <w:p>
             <w:r>
@@ -12549,6 +12556,7 @@
     </w:p>
     <w:p>
       <w:r>
+        <w:lastRenderedPageBreak/>
         <w:t>Unit testing isolates and tests the smallest testable parts or functions of the codebase independently, ensuring they behave correctly in isolation before integration. Key unit test scenarios include:</w:t>
       </w:r>
     </w:p>
@@ -12633,6 +12641,7 @@
     </w:p>
     <w:p>
       <w:r>
+        <w:lastRenderedPageBreak/>
         <w:t>Output testing guarantees that the system produces correct output data, secure download streams, and notifications based on valid user operations.</w:t>
       </w:r>
     </w:p>
@@ -12737,6 +12746,7 @@
     </w:p>
     <w:p>
       <w:r>
+        <w:lastRenderedPageBreak/>
         <w:t>• Dynamic Document Previews: Integrating PDF.js and rich text rendering tools to allow users to securely preview documents in-browser without physical download.</w:t>
       </w:r>
     </w:p>
@@ -12850,6 +12860,7 @@
     </w:p>
     <w:p>
       <w:r>
+        <w:lastRenderedPageBreak/>
         <w:t>7. Express Server Guide, Online: https://expressjs.com</w:t>
       </w:r>
     </w:p>
@@ -12864,7 +12875,7 @@
       </w:r>
     </w:p>
     <w:sectPr>
-      <w:headerReference w:type="default" r:id="rId13"/>
+      <w:headerReference w:type="default" r:id="rId9"/>
       <w:type w:val="continuous"/>
       <w:pgSz w:w="11910" w:h="16840"/>
       <w:pgMar w:top="1440" w:right="1440" w:bottom="1440" w:left="1440" w:header="720" w:footer="720" w:gutter="0"/>
@@ -12965,7 +12976,7 @@
           <w:rPr>
             <w:noProof/>
           </w:rPr>
-          <w:t>32</w:t>
+          <w:t>7</w:t>
         </w:r>
         <w:r>
           <w:rPr>
@@ -17390,7 +17401,7 @@
 </file>
 
 <file path=customXml/itemProps1.xml><?xml version="1.0" encoding="utf-8"?>
-<ds:datastoreItem xmlns:ds="http://schemas.openxmlformats.org/officeDocument/2006/customXml" ds:itemID="{9EEBEC05-3773-4329-B256-4FA4A6F97556}">
+<ds:datastoreItem xmlns:ds="http://schemas.openxmlformats.org/officeDocument/2006/customXml" ds:itemID="{D334D679-BC12-488F-964D-C74D6CB4ABE7}">
   <ds:schemaRefs>
     <ds:schemaRef ds:uri="http://schemas.openxmlformats.org/officeDocument/2006/bibliography"/>
   </ds:schemaRefs>

</xml_diff>

<commit_message>
Commit remaining docs and utility files
</commit_message>
<xml_diff>
--- a/LAB TIME SLOT MANAGEMENT.docx
+++ b/LAB TIME SLOT MANAGEMENT.docx
@@ -342,7 +342,7 @@
           <w:sz w:val="24"/>
           <w:szCs w:val="24"/>
         </w:rPr>
-        <w:t>DR.T.PARIMALAM</w:t>
+        <w:t>Dr. K. KARTHIKEYAN, MSc., MPhil., PhD., SET.,</w:t>
       </w:r>
     </w:p>
     <w:p>
@@ -364,7 +364,7 @@
           <w:sz w:val="24"/>
           <w:szCs w:val="24"/>
         </w:rPr>
-        <w:t>Associate Professor and Head,</w:t>
+        <w:t>Assistant Professor of Computer Science,</w:t>
       </w:r>
     </w:p>
     <w:p>
@@ -386,7 +386,7 @@
           <w:sz w:val="24"/>
           <w:szCs w:val="24"/>
         </w:rPr>
-        <w:t>PG and Research Department of Computer Science,</w:t>
+        <w:t>Department of Computer Science,</w:t>
       </w:r>
     </w:p>
     <w:p>
@@ -408,7 +408,7 @@
           <w:sz w:val="24"/>
           <w:szCs w:val="24"/>
         </w:rPr>
-        <w:t>Nandha</w:t>
+        <w:t>Puratchi Thalaivi Amma Government Arts and Science College, Palladam - 641664.</w:t>
       </w:r>
       <w:proofErr w:type="spellEnd"/>
       <w:r>
@@ -418,7 +418,7 @@
           <w:sz w:val="24"/>
           <w:szCs w:val="24"/>
         </w:rPr>
-        <w:t xml:space="preserve"> Arts and Science College, Erode.</w:t>
+        <w:t xml:space="preserve"> </w:t>
       </w:r>
     </w:p>
     <w:p>
@@ -439,7 +439,6 @@
           <w:sz w:val="24"/>
           <w:szCs w:val="24"/>
         </w:rPr>
-        <w:t>pari.phd12@gmail.com</w:t>
       </w:r>
     </w:p>
     <w:p>
@@ -459,7 +458,6 @@
           <w:sz w:val="24"/>
           <w:szCs w:val="24"/>
         </w:rPr>
-        <w:t>9842539332</w:t>
       </w:r>
     </w:p>
     <w:p>
@@ -919,7 +917,7 @@
           <w:sz w:val="24"/>
           <w:szCs w:val="24"/>
         </w:rPr>
-        <w:t>DR.T.PARIMALAM</w:t>
+        <w:t>Dr. K. KARTHIKEYAN, MSc., MPhil., PhD., SET.,</w:t>
       </w:r>
     </w:p>
     <w:p>
@@ -941,7 +939,7 @@
           <w:sz w:val="24"/>
           <w:szCs w:val="24"/>
         </w:rPr>
-        <w:t>Associate Professor and Head,</w:t>
+        <w:t>Assistant Professor of Computer Science,</w:t>
       </w:r>
     </w:p>
     <w:p>
@@ -963,7 +961,7 @@
           <w:sz w:val="24"/>
           <w:szCs w:val="24"/>
         </w:rPr>
-        <w:t>PG and Research Department of Computer Science,</w:t>
+        <w:t>Department of Computer Science,</w:t>
       </w:r>
     </w:p>
     <w:p>
@@ -985,7 +983,7 @@
           <w:sz w:val="24"/>
           <w:szCs w:val="24"/>
         </w:rPr>
-        <w:t>Nandha</w:t>
+        <w:t>Puratchi Thalaivi Amma Government Arts and Science College, Palladam - 641664.</w:t>
       </w:r>
       <w:proofErr w:type="spellEnd"/>
       <w:r>
@@ -995,7 +993,7 @@
           <w:sz w:val="24"/>
           <w:szCs w:val="24"/>
         </w:rPr>
-        <w:t xml:space="preserve"> Arts and Science College, Erode.</w:t>
+        <w:t xml:space="preserve"> </w:t>
       </w:r>
     </w:p>
     <w:p>
@@ -1016,7 +1014,6 @@
           <w:sz w:val="24"/>
           <w:szCs w:val="24"/>
         </w:rPr>
-        <w:t>pari.phd12@gmail.com</w:t>
       </w:r>
     </w:p>
     <w:p>
@@ -1036,7 +1033,6 @@
           <w:sz w:val="24"/>
           <w:szCs w:val="24"/>
         </w:rPr>
-        <w:t>9842539332</w:t>
       </w:r>
     </w:p>
     <w:p>
@@ -1591,7 +1587,7 @@
           <w:sz w:val="24"/>
           <w:szCs w:val="24"/>
         </w:rPr>
-        <w:t xml:space="preserve">                                                                                                  Associate Professor and Head</w:t>
+        <w:t xml:space="preserve">                                                                                                  Assistant Professor of Computer Science</w:t>
       </w:r>
     </w:p>
     <w:p>
@@ -2017,7 +2013,7 @@
           <w:sz w:val="24"/>
           <w:szCs w:val="24"/>
         </w:rPr>
-        <w:t>DR.T.PARIMALAM</w:t>
+        <w:t>Dr. K. KARTHIKEYAN, MSc., MPhil., PhD., SET.,</w:t>
       </w:r>
       <w:r>
         <w:rPr>
@@ -2850,7 +2846,7 @@
           <w:szCs w:val="24"/>
           <w:lang w:eastAsia="en-IN"/>
         </w:rPr>
-        <w:t>Dr. T. Parimalam</w:t>
+        <w:t>Dr. K. KARTHIKEYAN, MSc., MPhil., PhD., SET.,</w:t>
       </w:r>
       <w:r>
         <w:rPr>
@@ -2859,7 +2855,7 @@
           <w:szCs w:val="24"/>
           <w:lang w:eastAsia="en-IN"/>
         </w:rPr>
-        <w:t>, my project guide, for her valuable guidance, encouragement, and continuous support throughout this project. Her timely feedback and expert insights have been instrumental in shaping the project to its current form.</w:t>
+        <w:t xml:space="preserve"> my project guide, for his valuable guidance, encouragement, and continuous support throughout this project. His timely feedback and expert insights have been instrumental in shaping the project to its current form.</w:t>
       </w:r>
     </w:p>
     <w:p>
@@ -5255,6 +5251,9 @@
           <w:szCs w:val="32"/>
           <w:lang w:eastAsia="en-IN"/>
         </w:rPr>
+        <w:sectPr>
+          <w:type w:val="nextPage"/>
+        </w:sectPr>
       </w:pPr>
     </w:p>
     <w:p>
@@ -12876,6 +12875,7 @@
     </w:p>
     <w:sectPr>
       <w:headerReference w:type="default" r:id="rId9"/>
+      <w:footerReference w:type="default" r:id="rId12"/>
       <w:type w:val="continuous"/>
       <w:pgSz w:w="11910" w:h="16840"/>
       <w:pgMar w:top="1440" w:right="1440" w:bottom="1440" w:left="1440" w:header="720" w:footer="720" w:gutter="0"/>
@@ -12887,6 +12887,7 @@
       </w:pgBorders>
       <w:cols w:space="708"/>
       <w:docGrid w:linePitch="299"/>
+      <w:pgNumType w:start="1"/>
     </w:sectPr>
   </w:body>
 </w:document>
@@ -12915,6 +12916,23 @@
     </w:p>
   </w:endnote>
 </w:endnotes>
+</file>
+
+<file path=word/footer1.xml><?xml version="1.0" encoding="utf-8"?>
+<w:ftr xmlns:m="http://schemas.openxmlformats.org/officeDocument/2006/math" xmlns:mc="http://schemas.openxmlformats.org/markup-compatibility/2006" xmlns:mo="http://schemas.microsoft.com/office/mac/office/2008/main" xmlns:mv="urn:schemas-microsoft-com:mac:vml" xmlns:o="urn:schemas-microsoft-com:office:office" xmlns:r="http://schemas.openxmlformats.org/officeDocument/2006/relationships" xmlns:v="urn:schemas-microsoft-com:vml" xmlns:w10="urn:schemas-microsoft-com:office:word" xmlns:w14="http://schemas.microsoft.com/office/word/2010/wordml" xmlns:w="http://schemas.openxmlformats.org/wordprocessingml/2006/main" xmlns:wne="http://schemas.microsoft.com/office/word/2006/wordml" xmlns:wp14="http://schemas.microsoft.com/office/word/2010/wordprocessingDrawing" xmlns:wp="http://schemas.openxmlformats.org/drawingml/2006/wordprocessingDrawing" xmlns:wpc="http://schemas.microsoft.com/office/word/2010/wordprocessingCanvas" xmlns:wpg="http://schemas.microsoft.com/office/word/2010/wordprocessingGroup" xmlns:wpi="http://schemas.microsoft.com/office/word/2010/wordprocessingInk" xmlns:wps="http://schemas.microsoft.com/office/word/2010/wordprocessingShape" mc:Ignorable="w14 wp14">
+  <w:p>
+    <w:pPr>
+      <w:pStyle w:val="Footer"/>
+      <w:jc w:val="center"/>
+    </w:pPr>
+    <w:r/>
+    <w:r>
+      <w:fldChar w:fldCharType="begin"/>
+      <w:instrText xml:space="preserve">PAGE</w:instrText>
+      <w:fldChar w:fldCharType="end"/>
+    </w:r>
+  </w:p>
+</w:ftr>
 </file>
 
 <file path=word/footnotes.xml><?xml version="1.0" encoding="utf-8"?>

</xml_diff>